<commit_message>
Complete Step 6 — ADR Register v2.0. All 7 ADRs resolved. 3 APPROVED. 4 IN PROGRESS pending sign-off.
</commit_message>
<xml_diff>
--- a/docs/06-risk-analysis-and-adrs/RetailSphere_ADR_Register_v1.2.docx
+++ b/docs/06-risk-analysis-and-adrs/RetailSphere_ADR_Register_v1.2.docx
@@ -199,7 +199,7 @@
                 <w:sz w:val="18"/>
                 <w:szCs w:val="18"/>
               </w:rPr>
-              <w:t>1.0 — Initial register. 6 ADRs identified.</w:t>
+              <w:t>2.0 — Step 6 complete. 7 ADRs resolved. 3 APPROVED. 4 IN PROGRESS pending stakeholder sign-off.</w:t>
             </w:r>
           </w:p>
         </w:tc>
@@ -258,7 +258,31 @@
                 <w:sz w:val="18"/>
                 <w:szCs w:val="18"/>
               </w:rPr>
-              <w:t>17 April 2026</w:t>
+              <w:t>07</w:t>
+            </w:r>
+            <w:r>
+              <w:rPr>
+                <w:color w:val="1A1A1A"/>
+                <w:sz w:val="18"/>
+                <w:szCs w:val="18"/>
+              </w:rPr>
+              <w:t xml:space="preserve"> </w:t>
+            </w:r>
+            <w:r>
+              <w:rPr>
+                <w:color w:val="1A1A1A"/>
+                <w:sz w:val="18"/>
+                <w:szCs w:val="18"/>
+              </w:rPr>
+              <w:t>June</w:t>
+            </w:r>
+            <w:r>
+              <w:rPr>
+                <w:color w:val="1A1A1A"/>
+                <w:sz w:val="18"/>
+                <w:szCs w:val="18"/>
+              </w:rPr>
+              <w:t xml:space="preserve"> 2026</w:t>
             </w:r>
           </w:p>
         </w:tc>
@@ -377,7 +401,7 @@
                 <w:sz w:val="18"/>
                 <w:szCs w:val="18"/>
               </w:rPr>
-              <w:t>6 — All PENDING. Individual ADR documents to be written in Steps 6 and 9.</w:t>
+              <w:t>7 — 3 APPROVED. 4 IN PROGRESS.</w:t>
             </w:r>
           </w:p>
         </w:tc>
@@ -876,7 +900,7 @@
               <w:bottom w:val="single" w:sz="1" w:space="0" w:color="D0D8EC"/>
               <w:right w:val="single" w:sz="1" w:space="0" w:color="D0D8EC"/>
             </w:tcBorders>
-            <w:shd w:val="clear" w:color="auto" w:fill="FDF6E3"/>
+            <w:shd w:val="clear" w:color="auto" w:fill="F0FDF4"/>
             <w:tcMar>
               <w:top w:w="90" w:type="dxa"/>
               <w:left w:w="140" w:type="dxa"/>
@@ -893,11 +917,11 @@
               <w:rPr>
                 <w:b/>
                 <w:bCs/>
-                <w:color w:val="7A5C00"/>
-                <w:sz w:val="18"/>
-                <w:szCs w:val="18"/>
-              </w:rPr>
-              <w:t>PENDING</w:t>
+                <w:color w:val="166534"/>
+                <w:sz w:val="18"/>
+                <w:szCs w:val="18"/>
+              </w:rPr>
+              <w:t>APPROVED</w:t>
             </w:r>
           </w:p>
         </w:tc>
@@ -1078,7 +1102,7 @@
                 <w:sz w:val="18"/>
                 <w:szCs w:val="18"/>
               </w:rPr>
-              <w:t>PENDING</w:t>
+              <w:t>IN PROGRESS</w:t>
             </w:r>
           </w:p>
         </w:tc>
@@ -1258,7 +1282,7 @@
                 <w:sz w:val="18"/>
                 <w:szCs w:val="18"/>
               </w:rPr>
-              <w:t>PENDING</w:t>
+              <w:t>IN PROGRESS</w:t>
             </w:r>
           </w:p>
         </w:tc>
@@ -1417,7 +1441,7 @@
               <w:bottom w:val="single" w:sz="1" w:space="0" w:color="D0D8EC"/>
               <w:right w:val="single" w:sz="1" w:space="0" w:color="D0D8EC"/>
             </w:tcBorders>
-            <w:shd w:val="clear" w:color="auto" w:fill="FDF6E3"/>
+            <w:shd w:val="clear" w:color="auto" w:fill="F0FDF4"/>
             <w:tcMar>
               <w:top w:w="90" w:type="dxa"/>
               <w:left w:w="140" w:type="dxa"/>
@@ -1434,11 +1458,11 @@
               <w:rPr>
                 <w:b/>
                 <w:bCs/>
-                <w:color w:val="7A5C00"/>
-                <w:sz w:val="18"/>
-                <w:szCs w:val="18"/>
-              </w:rPr>
-              <w:t>PENDING</w:t>
+                <w:color w:val="166534"/>
+                <w:sz w:val="18"/>
+                <w:szCs w:val="18"/>
+              </w:rPr>
+              <w:t>APPROVED</w:t>
             </w:r>
           </w:p>
         </w:tc>
@@ -1597,7 +1621,7 @@
               <w:bottom w:val="single" w:sz="1" w:space="0" w:color="D0D8EC"/>
               <w:right w:val="single" w:sz="1" w:space="0" w:color="D0D8EC"/>
             </w:tcBorders>
-            <w:shd w:val="clear" w:color="auto" w:fill="FDF6E3"/>
+            <w:shd w:val="clear" w:color="auto" w:fill="F0FDF4"/>
             <w:tcMar>
               <w:top w:w="90" w:type="dxa"/>
               <w:left w:w="140" w:type="dxa"/>
@@ -1614,11 +1638,11 @@
               <w:rPr>
                 <w:b/>
                 <w:bCs/>
-                <w:color w:val="7A5C00"/>
-                <w:sz w:val="18"/>
-                <w:szCs w:val="18"/>
-              </w:rPr>
-              <w:t>PENDING</w:t>
+                <w:color w:val="166534"/>
+                <w:sz w:val="18"/>
+                <w:szCs w:val="18"/>
+              </w:rPr>
+              <w:t>APPROVED</w:t>
             </w:r>
           </w:p>
         </w:tc>
@@ -1798,7 +1822,7 @@
                 <w:sz w:val="18"/>
                 <w:szCs w:val="18"/>
               </w:rPr>
-              <w:t>PENDING</w:t>
+              <w:t>IN PROGRESS</w:t>
             </w:r>
           </w:p>
         </w:tc>
@@ -1855,6 +1879,248 @@
                 <w:szCs w:val="19"/>
               </w:rPr>
               <w:t>N. Mahlangu (CDO) + Rethabile Sithole (CCO)</w:t>
+            </w:r>
+          </w:p>
+        </w:tc>
+      </w:tr>
+      <w:tr>
+        <w:tc>
+          <w:tcPr>
+            <w:tcW w:w="900" w:type="dxa"/>
+            <w:tcBorders>
+              <w:top w:val="single" w:sz="1" w:space="0" w:color="D0D8EC"/>
+              <w:left w:val="single" w:sz="1" w:space="0" w:color="D0D8EC"/>
+              <w:bottom w:val="single" w:sz="1" w:space="0" w:color="D0D8EC"/>
+              <w:right w:val="single" w:sz="1" w:space="0" w:color="D0D8EC"/>
+            </w:tcBorders>
+            <w:shd w:val="clear" w:color="auto" w:fill="EEF1F8"/>
+            <w:tcMar>
+              <w:top w:w="90" w:type="dxa"/>
+              <w:left w:w="140" w:type="dxa"/>
+              <w:bottom w:w="90" w:type="dxa"/>
+              <w:right w:w="140" w:type="dxa"/>
+            </w:tcMar>
+          </w:tcPr>
+          <w:p>
+            <w:pPr>
+              <w:rPr>
+                <w:b/>
+                <w:bCs/>
+                <w:color w:val="1A2E5A"/>
+                <w:sz w:val="19"/>
+                <w:szCs w:val="19"/>
+              </w:rPr>
+            </w:pPr>
+            <w:r>
+              <w:rPr>
+                <w:b/>
+                <w:bCs/>
+                <w:color w:val="1A2E5A"/>
+                <w:sz w:val="19"/>
+                <w:szCs w:val="19"/>
+              </w:rPr>
+              <w:t>ADR-007</w:t>
+            </w:r>
+          </w:p>
+        </w:tc>
+        <w:tc>
+          <w:tcPr>
+            <w:tcW w:w="2800" w:type="dxa"/>
+            <w:tcBorders>
+              <w:top w:val="single" w:sz="1" w:space="0" w:color="D0D8EC"/>
+              <w:left w:val="single" w:sz="1" w:space="0" w:color="D0D8EC"/>
+              <w:bottom w:val="single" w:sz="1" w:space="0" w:color="D0D8EC"/>
+              <w:right w:val="single" w:sz="1" w:space="0" w:color="D0D8EC"/>
+            </w:tcBorders>
+            <w:shd w:val="clear" w:color="auto" w:fill="EEF1F8"/>
+            <w:tcMar>
+              <w:top w:w="90" w:type="dxa"/>
+              <w:left w:w="140" w:type="dxa"/>
+              <w:bottom w:w="90" w:type="dxa"/>
+              <w:right w:w="140" w:type="dxa"/>
+            </w:tcMar>
+          </w:tcPr>
+          <w:p>
+            <w:pPr>
+              <w:rPr>
+                <w:color w:val="1A1A1A"/>
+                <w:sz w:val="19"/>
+                <w:szCs w:val="19"/>
+              </w:rPr>
+            </w:pPr>
+            <w:r>
+              <w:rPr>
+                <w:color w:val="1A1A1A"/>
+                <w:sz w:val="19"/>
+                <w:szCs w:val="19"/>
+              </w:rPr>
+              <w:t>Contact Governance and Opt-out Propagation</w:t>
+            </w:r>
+          </w:p>
+        </w:tc>
+        <w:tc>
+          <w:tcPr>
+            <w:tcW w:w="1400" w:type="dxa"/>
+            <w:tcBorders>
+              <w:top w:val="single" w:sz="1" w:space="0" w:color="D0D8EC"/>
+              <w:left w:val="single" w:sz="1" w:space="0" w:color="D0D8EC"/>
+              <w:bottom w:val="single" w:sz="1" w:space="0" w:color="D0D8EC"/>
+              <w:right w:val="single" w:sz="1" w:space="0" w:color="D0D8EC"/>
+            </w:tcBorders>
+            <w:shd w:val="clear" w:color="auto" w:fill="EEF1F8"/>
+            <w:tcMar>
+              <w:top w:w="90" w:type="dxa"/>
+              <w:left w:w="140" w:type="dxa"/>
+              <w:bottom w:w="90" w:type="dxa"/>
+              <w:right w:w="140" w:type="dxa"/>
+            </w:tcMar>
+          </w:tcPr>
+          <w:p>
+            <w:pPr>
+              <w:rPr>
+                <w:i/>
+                <w:iCs/>
+                <w:color w:val="555555"/>
+                <w:sz w:val="19"/>
+                <w:szCs w:val="19"/>
+              </w:rPr>
+            </w:pPr>
+            <w:r>
+              <w:rPr>
+                <w:i/>
+                <w:iCs/>
+                <w:color w:val="555555"/>
+                <w:sz w:val="19"/>
+                <w:szCs w:val="19"/>
+              </w:rPr>
+              <w:t xml:space="preserve">Step 2 / </w:t>
+            </w:r>
+            <w:r>
+              <w:rPr>
+                <w:color w:val="1A1A1A"/>
+                <w:sz w:val="18"/>
+                <w:szCs w:val="18"/>
+              </w:rPr>
+              <w:t>BDR-001 v1.2.</w:t>
+            </w:r>
+          </w:p>
+        </w:tc>
+        <w:tc>
+          <w:tcPr>
+            <w:tcW w:w="1200" w:type="dxa"/>
+            <w:tcBorders>
+              <w:top w:val="single" w:sz="1" w:space="0" w:color="D0D8EC"/>
+              <w:left w:val="single" w:sz="1" w:space="0" w:color="D0D8EC"/>
+              <w:bottom w:val="single" w:sz="1" w:space="0" w:color="D0D8EC"/>
+              <w:right w:val="single" w:sz="1" w:space="0" w:color="D0D8EC"/>
+            </w:tcBorders>
+            <w:shd w:val="clear" w:color="auto" w:fill="FDF6E3"/>
+            <w:tcMar>
+              <w:top w:w="90" w:type="dxa"/>
+              <w:left w:w="140" w:type="dxa"/>
+              <w:bottom w:w="90" w:type="dxa"/>
+              <w:right w:w="140" w:type="dxa"/>
+            </w:tcMar>
+            <w:vAlign w:val="center"/>
+          </w:tcPr>
+          <w:p>
+            <w:pPr>
+              <w:jc w:val="center"/>
+              <w:rPr>
+                <w:b/>
+                <w:bCs/>
+                <w:color w:val="7A5C00"/>
+                <w:sz w:val="18"/>
+                <w:szCs w:val="18"/>
+              </w:rPr>
+            </w:pPr>
+            <w:r>
+              <w:rPr>
+                <w:b/>
+                <w:bCs/>
+                <w:color w:val="7A5C00"/>
+                <w:sz w:val="18"/>
+                <w:szCs w:val="18"/>
+              </w:rPr>
+              <w:t>IN PROGRESS</w:t>
+            </w:r>
+          </w:p>
+        </w:tc>
+        <w:tc>
+          <w:tcPr>
+            <w:tcW w:w="1560" w:type="dxa"/>
+            <w:tcBorders>
+              <w:top w:val="single" w:sz="1" w:space="0" w:color="D0D8EC"/>
+              <w:left w:val="single" w:sz="1" w:space="0" w:color="D0D8EC"/>
+              <w:bottom w:val="single" w:sz="1" w:space="0" w:color="D0D8EC"/>
+              <w:right w:val="single" w:sz="1" w:space="0" w:color="D0D8EC"/>
+            </w:tcBorders>
+            <w:shd w:val="clear" w:color="auto" w:fill="EEF1F8"/>
+            <w:tcMar>
+              <w:top w:w="90" w:type="dxa"/>
+              <w:left w:w="140" w:type="dxa"/>
+              <w:bottom w:w="90" w:type="dxa"/>
+              <w:right w:w="140" w:type="dxa"/>
+            </w:tcMar>
+          </w:tcPr>
+          <w:p>
+            <w:pPr>
+              <w:rPr>
+                <w:color w:val="555555"/>
+                <w:sz w:val="19"/>
+                <w:szCs w:val="19"/>
+              </w:rPr>
+            </w:pPr>
+            <w:r>
+              <w:rPr>
+                <w:color w:val="555555"/>
+                <w:sz w:val="19"/>
+                <w:szCs w:val="19"/>
+              </w:rPr>
+              <w:t>T. Mbalo (DSA)</w:t>
+            </w:r>
+          </w:p>
+        </w:tc>
+        <w:tc>
+          <w:tcPr>
+            <w:tcW w:w="1500" w:type="dxa"/>
+            <w:tcBorders>
+              <w:top w:val="single" w:sz="1" w:space="0" w:color="D0D8EC"/>
+              <w:left w:val="single" w:sz="1" w:space="0" w:color="D0D8EC"/>
+              <w:bottom w:val="single" w:sz="1" w:space="0" w:color="D0D8EC"/>
+              <w:right w:val="single" w:sz="1" w:space="0" w:color="D0D8EC"/>
+            </w:tcBorders>
+            <w:shd w:val="clear" w:color="auto" w:fill="EEF1F8"/>
+            <w:tcMar>
+              <w:top w:w="90" w:type="dxa"/>
+              <w:left w:w="140" w:type="dxa"/>
+              <w:bottom w:w="90" w:type="dxa"/>
+              <w:right w:w="140" w:type="dxa"/>
+            </w:tcMar>
+          </w:tcPr>
+          <w:p>
+            <w:pPr>
+              <w:rPr>
+                <w:color w:val="555555"/>
+                <w:sz w:val="19"/>
+                <w:szCs w:val="19"/>
+              </w:rPr>
+            </w:pPr>
+            <w:r>
+              <w:rPr>
+                <w:color w:val="555555"/>
+                <w:sz w:val="19"/>
+                <w:szCs w:val="19"/>
+              </w:rPr>
+              <w:t xml:space="preserve">N. Mahlangu (CDO) + </w:t>
+            </w:r>
+            <w:r>
+              <w:rPr>
+                <w:color w:val="1A1A1A"/>
+                <w:sz w:val="18"/>
+                <w:szCs w:val="18"/>
+              </w:rPr>
+              <w:t>Priya Naidoo (Head of CRM &amp; Loyalty)</w:t>
             </w:r>
           </w:p>
         </w:tc>
@@ -1885,13 +2151,16 @@
     </w:p>
     <w:p>
       <w:pPr>
-        <w:spacing w:before="80" w:after="80"/>
+        <w:spacing w:before="200"/>
+        <w:rPr>
+          <w:color w:val="1A1A1A"/>
+        </w:rPr>
       </w:pPr>
       <w:r>
         <w:rPr>
           <w:color w:val="1A1A1A"/>
         </w:rPr>
-        <w:t>Full ADR documents will be written during Steps 6 and 9. The summaries below capture the context, provisional decision direction, and dependencies for each ADR to ensure no information is lost between steps.</w:t>
+        <w:t>Step 6 ADR Resolution is complete. All 7 ADRs have been formally documented with context, options, decision direction, and consequences. 3 ADRs are APPROVED and ready for implementation. 4 ADRs are IN PROGRESS pending stakeholder and legal sign-off before implementation can proceed. Step 9 Physical Database Design depends on ADR-001 and ADR-002 being fully APPROVED.</w:t>
       </w:r>
     </w:p>
     <w:p>
@@ -1978,24 +2247,54 @@
               <w:bottom w:val="single" w:sz="1" w:space="0" w:color="D0D8EC"/>
               <w:right w:val="single" w:sz="1" w:space="0" w:color="D0D8EC"/>
             </w:tcBorders>
-            <w:shd w:val="clear" w:color="auto" w:fill="FDF6E3"/>
-            <w:tcMar>
-              <w:top w:w="80" w:type="dxa"/>
-              <w:left w:w="120" w:type="dxa"/>
-              <w:bottom w:w="80" w:type="dxa"/>
-              <w:right w:w="120" w:type="dxa"/>
-            </w:tcMar>
-          </w:tcPr>
-          <w:p>
-            <w:r>
-              <w:rPr>
-                <w:b/>
-                <w:bCs/>
-                <w:color w:val="7A5C00"/>
-                <w:sz w:val="18"/>
-                <w:szCs w:val="18"/>
-              </w:rPr>
-              <w:t>PENDING</w:t>
+            <w:shd w:val="clear" w:color="auto" w:fill="F0FDF4"/>
+            <w:tcMar>
+              <w:top w:w="80" w:type="dxa"/>
+              <w:left w:w="120" w:type="dxa"/>
+              <w:bottom w:w="80" w:type="dxa"/>
+              <w:right w:w="120" w:type="dxa"/>
+            </w:tcMar>
+          </w:tcPr>
+          <w:p>
+            <w:r>
+              <w:rPr>
+                <w:b/>
+                <w:bCs/>
+                <w:color w:val="166534"/>
+                <w:sz w:val="18"/>
+                <w:szCs w:val="18"/>
+              </w:rPr>
+              <w:t>APPROVED</w:t>
+            </w:r>
+            <w:r>
+              <w:rPr>
+                <w:b/>
+                <w:bCs/>
+                <w:color w:val="166534"/>
+                <w:sz w:val="18"/>
+                <w:szCs w:val="18"/>
+              </w:rPr>
+              <w:t xml:space="preserve"> </w:t>
+            </w:r>
+            <w:r>
+              <w:rPr>
+                <w:b/>
+                <w:bCs/>
+                <w:color w:val="166534"/>
+                <w:sz w:val="18"/>
+                <w:szCs w:val="18"/>
+              </w:rPr>
+              <w:t xml:space="preserve">– </w:t>
+            </w:r>
+            <w:r>
+              <w:rPr>
+                <w:b/>
+                <w:bCs/>
+                <w:color w:val="166534"/>
+                <w:sz w:val="18"/>
+                <w:szCs w:val="18"/>
+              </w:rPr>
+              <w:t>06 June 2026</w:t>
             </w:r>
           </w:p>
         </w:tc>
@@ -2054,7 +2353,7 @@
                 <w:sz w:val="18"/>
                 <w:szCs w:val="18"/>
               </w:rPr>
-              <w:t>Step 6 — Risk Analysis</w:t>
+              <w:t>Step 6 — Risk Analysis and ADR Resolution</w:t>
             </w:r>
           </w:p>
         </w:tc>
@@ -2113,7 +2412,7 @@
                 <w:sz w:val="18"/>
                 <w:szCs w:val="18"/>
               </w:rPr>
-              <w:t>BDR-001 v1.0 — Step 1</w:t>
+              <w:t>BDR step 1 and BPA step 2, where three different systems have three different product codes for the same product.</w:t>
             </w:r>
           </w:p>
         </w:tc>
@@ -2231,7 +2530,7 @@
                 <w:sz w:val="18"/>
                 <w:szCs w:val="18"/>
               </w:rPr>
-              <w:t>Step 6 completion</w:t>
+              <w:t>RESOLVED — Step 6</w:t>
             </w:r>
           </w:p>
         </w:tc>
@@ -2292,6 +2591,22 @@
               </w:rPr>
               <w:t>SAP ECC stock code ≠ Oracle MICROS POS product code ≠ Shopify SKU. No master product identifier exists across RetailSphere's three primary transactional systems. Cross-domain product reporting is impossible without resolution.</w:t>
             </w:r>
+            <w:r>
+              <w:rPr>
+                <w:color w:val="1A1A1A"/>
+                <w:sz w:val="18"/>
+                <w:szCs w:val="18"/>
+              </w:rPr>
+              <w:t xml:space="preserve"> </w:t>
+            </w:r>
+            <w:r>
+              <w:rPr>
+                <w:color w:val="1A1A1A"/>
+                <w:sz w:val="18"/>
+                <w:szCs w:val="18"/>
+              </w:rPr>
+              <w:t>The platform will solve this by creating a surrogate key in the Silver layer Product Dimension by matching the barcode (UPC/EAN) from all systems.</w:t>
+            </w:r>
           </w:p>
         </w:tc>
       </w:tr>
@@ -2335,40 +2650,139 @@
               <w:bottom w:val="single" w:sz="1" w:space="0" w:color="D0D8EC"/>
               <w:right w:val="single" w:sz="1" w:space="0" w:color="D0D8EC"/>
             </w:tcBorders>
-            <w:shd w:val="clear" w:color="auto" w:fill="FDF6E3"/>
-            <w:tcMar>
-              <w:top w:w="80" w:type="dxa"/>
-              <w:left w:w="120" w:type="dxa"/>
-              <w:bottom w:w="80" w:type="dxa"/>
-              <w:right w:w="120" w:type="dxa"/>
-            </w:tcMar>
-          </w:tcPr>
-          <w:p>
-            <w:r>
-              <w:rPr>
-                <w:color w:val="7A5C00"/>
-                <w:sz w:val="18"/>
-                <w:szCs w:val="18"/>
-              </w:rPr>
-              <w:t xml:space="preserve">PENDING — To be determined in Step 6 Risk Analysis. Options under consideration: (1) SAP as master with cross-reference mapping. (2) New surrogate product key generated in </w:t>
-            </w:r>
-            <w:proofErr w:type="gramStart"/>
-            <w:r>
-              <w:rPr>
-                <w:color w:val="7A5C00"/>
-                <w:sz w:val="18"/>
-                <w:szCs w:val="18"/>
-              </w:rPr>
-              <w:t>Silver</w:t>
-            </w:r>
-            <w:proofErr w:type="gramEnd"/>
-            <w:r>
-              <w:rPr>
-                <w:color w:val="7A5C00"/>
-                <w:sz w:val="18"/>
-                <w:szCs w:val="18"/>
-              </w:rPr>
-              <w:t xml:space="preserve"> layer with source system cross-reference table. (3) Hybrid — SAP as authoritative for procurement and inventory; surrogate key for sales and marketing.</w:t>
+            <w:shd w:val="clear" w:color="auto" w:fill="F0FDF4"/>
+            <w:tcMar>
+              <w:top w:w="80" w:type="dxa"/>
+              <w:left w:w="120" w:type="dxa"/>
+              <w:bottom w:w="80" w:type="dxa"/>
+              <w:right w:w="120" w:type="dxa"/>
+            </w:tcMar>
+          </w:tcPr>
+          <w:p>
+            <w:pPr>
+              <w:rPr>
+                <w:color w:val="166534"/>
+              </w:rPr>
+            </w:pPr>
+            <w:r>
+              <w:rPr>
+                <w:color w:val="166534"/>
+                <w:sz w:val="18"/>
+                <w:szCs w:val="18"/>
+              </w:rPr>
+              <w:t xml:space="preserve">DECIDED - Product Dimension. Following the fallback matching hierarchy </w:t>
+            </w:r>
+            <w:r>
+              <w:rPr>
+                <w:color w:val="166534"/>
+                <w:sz w:val="18"/>
+                <w:szCs w:val="18"/>
+              </w:rPr>
+              <w:t>–</w:t>
+            </w:r>
+            <w:r>
+              <w:rPr>
+                <w:color w:val="166534"/>
+                <w:sz w:val="18"/>
+                <w:szCs w:val="18"/>
+              </w:rPr>
+              <w:t xml:space="preserve"> </w:t>
+            </w:r>
+            <w:r>
+              <w:rPr>
+                <w:color w:val="166534"/>
+                <w:sz w:val="18"/>
+                <w:szCs w:val="18"/>
+              </w:rPr>
+              <w:t>(</w:t>
+            </w:r>
+            <w:r>
+              <w:rPr>
+                <w:color w:val="166534"/>
+                <w:sz w:val="18"/>
+                <w:szCs w:val="18"/>
+              </w:rPr>
+              <w:t>1</w:t>
+            </w:r>
+            <w:r>
+              <w:rPr>
+                <w:color w:val="166534"/>
+                <w:sz w:val="18"/>
+                <w:szCs w:val="18"/>
+              </w:rPr>
+              <w:t xml:space="preserve">) </w:t>
+            </w:r>
+            <w:r>
+              <w:rPr>
+                <w:color w:val="166534"/>
+                <w:sz w:val="18"/>
+                <w:szCs w:val="18"/>
+              </w:rPr>
+              <w:t xml:space="preserve">Barcode match - most reliable. </w:t>
+            </w:r>
+            <w:r>
+              <w:rPr>
+                <w:color w:val="166534"/>
+                <w:sz w:val="18"/>
+                <w:szCs w:val="18"/>
+              </w:rPr>
+              <w:t>(</w:t>
+            </w:r>
+            <w:r>
+              <w:rPr>
+                <w:color w:val="166534"/>
+                <w:sz w:val="18"/>
+                <w:szCs w:val="18"/>
+              </w:rPr>
+              <w:t>2</w:t>
+            </w:r>
+            <w:r>
+              <w:rPr>
+                <w:color w:val="166534"/>
+                <w:sz w:val="18"/>
+                <w:szCs w:val="18"/>
+              </w:rPr>
+              <w:t xml:space="preserve">) </w:t>
+            </w:r>
+            <w:r>
+              <w:rPr>
+                <w:color w:val="166534"/>
+                <w:sz w:val="18"/>
+                <w:szCs w:val="18"/>
+              </w:rPr>
+              <w:t xml:space="preserve">Product name + category match - fuzzy matching. </w:t>
+            </w:r>
+            <w:r>
+              <w:rPr>
+                <w:color w:val="166534"/>
+                <w:sz w:val="18"/>
+                <w:szCs w:val="18"/>
+              </w:rPr>
+              <w:t>(</w:t>
+            </w:r>
+            <w:r>
+              <w:rPr>
+                <w:color w:val="166534"/>
+                <w:sz w:val="18"/>
+                <w:szCs w:val="18"/>
+              </w:rPr>
+              <w:t>3</w:t>
+            </w:r>
+            <w:r>
+              <w:rPr>
+                <w:color w:val="166534"/>
+                <w:sz w:val="18"/>
+                <w:szCs w:val="18"/>
+              </w:rPr>
+              <w:t xml:space="preserve">) </w:t>
+            </w:r>
+            <w:r>
+              <w:rPr>
+                <w:color w:val="166534"/>
+                <w:sz w:val="18"/>
+                <w:szCs w:val="18"/>
+              </w:rPr>
+              <w:t>Manual resolution by Sipho's team - human validation queue (same approach as PDF extraction)</w:t>
             </w:r>
           </w:p>
         </w:tc>
@@ -2400,20 +2814,8 @@
                 <w:sz w:val="18"/>
                 <w:szCs w:val="18"/>
               </w:rPr>
-              <w:t xml:space="preserve">Consequences if </w:t>
-            </w:r>
-            <w:proofErr w:type="gramStart"/>
-            <w:r>
-              <w:rPr>
-                <w:b/>
-                <w:bCs/>
-                <w:color w:val="1A2E5A"/>
-                <w:sz w:val="18"/>
-                <w:szCs w:val="18"/>
-              </w:rPr>
-              <w:t>Delayed</w:t>
-            </w:r>
-            <w:proofErr w:type="gramEnd"/>
+              <w:t>Consequences if Delayed</w:t>
+            </w:r>
           </w:p>
         </w:tc>
         <w:tc>
@@ -2425,38 +2827,26 @@
               <w:bottom w:val="single" w:sz="1" w:space="0" w:color="D0D8EC"/>
               <w:right w:val="single" w:sz="1" w:space="0" w:color="D0D8EC"/>
             </w:tcBorders>
-            <w:shd w:val="clear" w:color="auto" w:fill="FDF0F0"/>
-            <w:tcMar>
-              <w:top w:w="80" w:type="dxa"/>
-              <w:left w:w="120" w:type="dxa"/>
-              <w:bottom w:w="80" w:type="dxa"/>
-              <w:right w:w="120" w:type="dxa"/>
-            </w:tcMar>
-          </w:tcPr>
-          <w:p>
-            <w:r>
-              <w:rPr>
-                <w:color w:val="8B1A1A"/>
-                <w:sz w:val="18"/>
-                <w:szCs w:val="18"/>
-              </w:rPr>
-              <w:t xml:space="preserve">Until resolved: no reliable cross-channel product performance reporting. Affects Procurement, Inventory Management, and Sales domains. Impacts Step </w:t>
-            </w:r>
-            <w:r>
-              <w:rPr>
-                <w:color w:val="8B1A1A"/>
-                <w:sz w:val="18"/>
-                <w:szCs w:val="18"/>
-              </w:rPr>
-              <w:t>7-dimensional</w:t>
-            </w:r>
-            <w:r>
-              <w:rPr>
-                <w:color w:val="8B1A1A"/>
-                <w:sz w:val="18"/>
-                <w:szCs w:val="18"/>
-              </w:rPr>
-              <w:t xml:space="preserve"> model design — Product dimension cannot be finalised without this decision.</w:t>
+            <w:tcMar>
+              <w:top w:w="80" w:type="dxa"/>
+              <w:left w:w="120" w:type="dxa"/>
+              <w:bottom w:w="80" w:type="dxa"/>
+              <w:right w:w="120" w:type="dxa"/>
+            </w:tcMar>
+          </w:tcPr>
+          <w:p>
+            <w:pPr>
+              <w:rPr>
+                <w:color w:val="1A1A1A"/>
+              </w:rPr>
+            </w:pPr>
+            <w:r>
+              <w:rPr>
+                <w:color w:val="1A1A1A"/>
+                <w:sz w:val="18"/>
+                <w:szCs w:val="18"/>
+              </w:rPr>
+              <w:t>N/A - Decision made.</w:t>
             </w:r>
           </w:p>
         </w:tc>
@@ -2488,6 +2878,7 @@
                 <w:sz w:val="18"/>
                 <w:szCs w:val="18"/>
               </w:rPr>
+              <w:lastRenderedPageBreak/>
               <w:t>Dependencies</w:t>
             </w:r>
           </w:p>
@@ -2517,7 +2908,7 @@
                 <w:sz w:val="18"/>
                 <w:szCs w:val="18"/>
               </w:rPr>
-              <w:t>Source system data profiling (Step 5). Stakeholder agreement from Sipho Dlamini (Procurement) and Zanele Mokoena (Inventory).</w:t>
+              <w:t>All downstream steps — Steps 7-18 depend on this decision being locked.</w:t>
             </w:r>
           </w:p>
         </w:tc>
@@ -2594,7 +2985,6 @@
                 <w:sz w:val="18"/>
                 <w:szCs w:val="18"/>
               </w:rPr>
-              <w:lastRenderedPageBreak/>
               <w:t>Status</w:t>
             </w:r>
           </w:p>
@@ -2617,15 +3007,16 @@
             </w:tcMar>
           </w:tcPr>
           <w:p>
-            <w:r>
-              <w:rPr>
-                <w:b/>
-                <w:bCs/>
+            <w:pPr>
+              <w:rPr>
                 <w:color w:val="7A5C00"/>
-                <w:sz w:val="18"/>
-                <w:szCs w:val="18"/>
-              </w:rPr>
-              <w:t>PENDING</w:t>
+              </w:rPr>
+            </w:pPr>
+            <w:r>
+              <w:rPr>
+                <w:color w:val="7A5C00"/>
+              </w:rPr>
+              <w:t>IN PROGRESS</w:t>
             </w:r>
           </w:p>
         </w:tc>
@@ -2684,7 +3075,7 @@
                 <w:sz w:val="18"/>
                 <w:szCs w:val="18"/>
               </w:rPr>
-              <w:t>Step 6 — Risk Analysis</w:t>
+              <w:t>Step 6 — Risk Analysis and ADR Resolution</w:t>
             </w:r>
           </w:p>
         </w:tc>
@@ -2861,7 +3252,7 @@
                 <w:sz w:val="18"/>
                 <w:szCs w:val="18"/>
               </w:rPr>
-              <w:t>Step 6 completion</w:t>
+              <w:t>Pending POPIA Legal review.</w:t>
             </w:r>
           </w:p>
         </w:tc>
@@ -2965,22 +3356,27 @@
               <w:bottom w:val="single" w:sz="1" w:space="0" w:color="D0D8EC"/>
               <w:right w:val="single" w:sz="1" w:space="0" w:color="D0D8EC"/>
             </w:tcBorders>
-            <w:shd w:val="clear" w:color="auto" w:fill="FDF6E3"/>
-            <w:tcMar>
-              <w:top w:w="80" w:type="dxa"/>
-              <w:left w:w="120" w:type="dxa"/>
-              <w:bottom w:w="80" w:type="dxa"/>
-              <w:right w:w="120" w:type="dxa"/>
-            </w:tcMar>
-          </w:tcPr>
-          <w:p>
-            <w:r>
-              <w:rPr>
-                <w:color w:val="7A5C00"/>
-                <w:sz w:val="18"/>
-                <w:szCs w:val="18"/>
-              </w:rPr>
-              <w:t>PENDING — CDO instruction (v1.1 comment): ADR must specify whether deterministic matching (name + DOB + phone + email) or probabilistic matching is used. POPIA legal sign-off required before implementation. Segment framework (anonymous in-store, online-only, loyalty-only, full cross-channel) to be implemented as interim measure pending full identity resolution.</w:t>
+            <w:shd w:val="clear" w:color="auto" w:fill="F0FDF4"/>
+            <w:tcMar>
+              <w:top w:w="80" w:type="dxa"/>
+              <w:left w:w="120" w:type="dxa"/>
+              <w:bottom w:w="80" w:type="dxa"/>
+              <w:right w:w="120" w:type="dxa"/>
+            </w:tcMar>
+          </w:tcPr>
+          <w:p>
+            <w:pPr>
+              <w:rPr>
+                <w:color w:val="166534"/>
+              </w:rPr>
+            </w:pPr>
+            <w:r>
+              <w:rPr>
+                <w:color w:val="166534"/>
+                <w:sz w:val="18"/>
+                <w:szCs w:val="18"/>
+              </w:rPr>
+              <w:t>DECIDED - Customer Dimension in Silver Layer. Following the fallback matching hierarchy - (1) Deterministic - exact match: ID Number - most reliable, capture it for loyalty. (2) High Confidence: First name + Last name + Phone number. People rarely change names, and cell numbers are relatively stable. (3) Medium confidence (fuzzy): Email address + First name. Email can change, but a first name narrows the match significantly. (4) Low confidence: Phone number + First name only. Weaker - requires human validation before linking identities. (5) Anonymous: 66% of in-store transactions. No identity signal available. Segment as Anonymous in-store, cannot be linked - documented in FR-SAL-003 customer segments.</w:t>
             </w:r>
           </w:p>
         </w:tc>
@@ -3012,20 +3408,8 @@
                 <w:sz w:val="18"/>
                 <w:szCs w:val="18"/>
               </w:rPr>
-              <w:t xml:space="preserve">Consequences if </w:t>
-            </w:r>
-            <w:proofErr w:type="gramStart"/>
-            <w:r>
-              <w:rPr>
-                <w:b/>
-                <w:bCs/>
-                <w:color w:val="1A2E5A"/>
-                <w:sz w:val="18"/>
-                <w:szCs w:val="18"/>
-              </w:rPr>
-              <w:t>Delayed</w:t>
-            </w:r>
-            <w:proofErr w:type="gramEnd"/>
+              <w:t>Consequences if Delayed</w:t>
+            </w:r>
           </w:p>
         </w:tc>
         <w:tc>
@@ -3052,7 +3436,7 @@
                 <w:sz w:val="18"/>
                 <w:szCs w:val="18"/>
               </w:rPr>
-              <w:t>Until resolved: no Customer Lifetime Value calculation, no true retention rate, no closed-loop attribution. Affects Sales, Customer Loyalty, and Marketing domains. Customer dimension SCD Type 2 design in Step 7 depends on this decision.</w:t>
+              <w:t>Until resolved, no Customer Lifetime Value calculation, no true retention rate, no closed-loop attribution. Affects Sales, Customer Loyalty, and Marketing domains. Customer dimension SCD Type 2 design in Step 7 depends on this decision.</w:t>
             </w:r>
           </w:p>
         </w:tc>
@@ -3113,7 +3497,77 @@
                 <w:sz w:val="18"/>
                 <w:szCs w:val="18"/>
               </w:rPr>
-              <w:t>POPIA legal review. Data profiling of email match rate between Shopify and Salesforce (Step 5). Stakeholder sign-off from Priya Naidoo and Rethabile Sithole.</w:t>
+              <w:t>POPIA legal review. Data profiling of email match rate between Shopify and Salesforce</w:t>
+            </w:r>
+            <w:r>
+              <w:rPr>
+                <w:i/>
+                <w:iCs/>
+                <w:color w:val="555555"/>
+                <w:sz w:val="18"/>
+                <w:szCs w:val="18"/>
+              </w:rPr>
+              <w:t xml:space="preserve"> TBC from Step 5 investigation. Must be completed before Silver Layer identity resolution is built</w:t>
+            </w:r>
+            <w:r>
+              <w:rPr>
+                <w:i/>
+                <w:iCs/>
+                <w:color w:val="555555"/>
+                <w:sz w:val="18"/>
+                <w:szCs w:val="18"/>
+              </w:rPr>
+              <w:t xml:space="preserve">)—stakeholder sign-off from Priya Naidoo </w:t>
+            </w:r>
+            <w:r>
+              <w:rPr>
+                <w:i/>
+                <w:iCs/>
+                <w:color w:val="555555"/>
+                <w:sz w:val="18"/>
+                <w:szCs w:val="18"/>
+              </w:rPr>
+              <w:t xml:space="preserve">(Head of CRM and Loyalty) </w:t>
+            </w:r>
+            <w:r>
+              <w:rPr>
+                <w:i/>
+                <w:iCs/>
+                <w:color w:val="555555"/>
+                <w:sz w:val="18"/>
+                <w:szCs w:val="18"/>
+              </w:rPr>
+              <w:t>and Rethabile Sithole</w:t>
+            </w:r>
+            <w:r>
+              <w:rPr>
+                <w:i/>
+                <w:iCs/>
+                <w:color w:val="555555"/>
+                <w:sz w:val="18"/>
+                <w:szCs w:val="18"/>
+              </w:rPr>
+              <w:t xml:space="preserve"> (CCO)</w:t>
+            </w:r>
+            <w:r>
+              <w:rPr>
+                <w:i/>
+                <w:iCs/>
+                <w:color w:val="555555"/>
+                <w:sz w:val="18"/>
+                <w:szCs w:val="18"/>
+              </w:rPr>
+              <w:t>.</w:t>
+            </w:r>
+            <w:r>
+              <w:rPr>
+                <w:i/>
+                <w:iCs/>
+                <w:color w:val="555555"/>
+                <w:sz w:val="18"/>
+                <w:szCs w:val="18"/>
+              </w:rPr>
+              <w:t>.</w:t>
             </w:r>
           </w:p>
         </w:tc>
@@ -3220,7 +3674,7 @@
                 <w:sz w:val="18"/>
                 <w:szCs w:val="18"/>
               </w:rPr>
-              <w:t>PENDING</w:t>
+              <w:t>IN PROGRESS</w:t>
             </w:r>
           </w:p>
         </w:tc>
@@ -3279,7 +3733,7 @@
                 <w:sz w:val="18"/>
                 <w:szCs w:val="18"/>
               </w:rPr>
-              <w:t>Step 6 — Risk Analysis</w:t>
+              <w:t>Step 6 — Risk Analysis and ADR Resolution</w:t>
             </w:r>
           </w:p>
         </w:tc>
@@ -3338,7 +3792,7 @@
                 <w:sz w:val="18"/>
                 <w:szCs w:val="18"/>
               </w:rPr>
-              <w:t>Step 2 — Sipho Dlamini interview</w:t>
+              <w:t>Step 2 — Sipho Dlamini interview BPA-001</w:t>
             </w:r>
           </w:p>
         </w:tc>
@@ -3397,7 +3851,7 @@
                 <w:sz w:val="18"/>
                 <w:szCs w:val="18"/>
               </w:rPr>
-              <w:t>T. Mbalo (DSA) — Approver: N. Mahlangu (CDO) + Sipho Dlamini</w:t>
+              <w:t>T. Mbalo (DSA) — Approver: N. Mahlangu (CDO) + Sipho Dlamini (Head of Procurement)</w:t>
             </w:r>
           </w:p>
         </w:tc>
@@ -3456,7 +3910,7 @@
                 <w:sz w:val="18"/>
                 <w:szCs w:val="18"/>
               </w:rPr>
-              <w:t>Step 6 completion</w:t>
+              <w:t>Pending Sipho Dlamini and N. Mahlangu formal sign-off.</w:t>
             </w:r>
           </w:p>
         </w:tc>
@@ -3515,25 +3969,7 @@
                 <w:sz w:val="18"/>
                 <w:szCs w:val="18"/>
               </w:rPr>
-              <w:t xml:space="preserve">RetailSphere has 340 active supplier contracts stored as PDF documents on a shared drive. These contracts contain contracted lead times, payment terms, and price schedules — data required to calculate price variance against contracted rates (one of Sipho's five Monday morning metrics). </w:t>
-            </w:r>
-            <w:proofErr w:type="spellStart"/>
-            <w:r>
-              <w:rPr>
-                <w:color w:val="1A1A1A"/>
-                <w:sz w:val="18"/>
-                <w:szCs w:val="18"/>
-              </w:rPr>
-              <w:t>pypdf</w:t>
-            </w:r>
-            <w:proofErr w:type="spellEnd"/>
-            <w:r>
-              <w:rPr>
-                <w:color w:val="1A1A1A"/>
-                <w:sz w:val="18"/>
-                <w:szCs w:val="18"/>
-              </w:rPr>
-              <w:t xml:space="preserve"> can extract text but cannot produce structured fields without additional processing.</w:t>
+              <w:t>RetailSphere has 340 active supplier contracts stored as PDF documents on a shared drive. These contracts contain contracted lead times, payment terms, and price schedules — data required to calculate price variance against contracted rates (one of Sipho's five Monday morning metrics). pypdf can extract text, but cannot produce structured fields without additional processing.</w:t>
             </w:r>
           </w:p>
         </w:tc>
@@ -3578,22 +4014,43 @@
               <w:bottom w:val="single" w:sz="1" w:space="0" w:color="D0D8EC"/>
               <w:right w:val="single" w:sz="1" w:space="0" w:color="D0D8EC"/>
             </w:tcBorders>
-            <w:shd w:val="clear" w:color="auto" w:fill="FDF6E3"/>
-            <w:tcMar>
-              <w:top w:w="80" w:type="dxa"/>
-              <w:left w:w="120" w:type="dxa"/>
-              <w:bottom w:w="80" w:type="dxa"/>
-              <w:right w:w="120" w:type="dxa"/>
-            </w:tcMar>
-          </w:tcPr>
-          <w:p>
-            <w:r>
-              <w:rPr>
-                <w:color w:val="7A5C00"/>
-                <w:sz w:val="18"/>
-                <w:szCs w:val="18"/>
-              </w:rPr>
-              <w:t>PENDING — Two options under consideration: (1) Rule-based extraction using Python regex — fast to build, brittle to contract wording variation. (2) LLM-assisted extraction with human review queue for low-confidence outputs — more robust, higher cost per document. Recommended approach: LLM extraction hybrid with human validation before dimension table population.</w:t>
+            <w:shd w:val="clear" w:color="auto" w:fill="F0FDF4"/>
+            <w:tcMar>
+              <w:top w:w="80" w:type="dxa"/>
+              <w:left w:w="120" w:type="dxa"/>
+              <w:bottom w:w="80" w:type="dxa"/>
+              <w:right w:w="120" w:type="dxa"/>
+            </w:tcMar>
+          </w:tcPr>
+          <w:p>
+            <w:pPr>
+              <w:rPr>
+                <w:color w:val="166534"/>
+              </w:rPr>
+            </w:pPr>
+            <w:r>
+              <w:rPr>
+                <w:color w:val="166534"/>
+                <w:sz w:val="18"/>
+                <w:szCs w:val="18"/>
+              </w:rPr>
+              <w:t xml:space="preserve">DECIDED - LLM-assisted hybrid approach. (1) Text extraction: pypdf extracts raw text from each PDF document and handles standard PDF text layers. (2) LLM Structuring: LLM (Claude or similar) reads the extracted text and identifies key fields: Contracted rate per product, Lead time in days, Payment </w:t>
+            </w:r>
+            <w:r>
+              <w:rPr>
+                <w:color w:val="166534"/>
+                <w:sz w:val="18"/>
+                <w:szCs w:val="18"/>
+              </w:rPr>
+              <w:t>terms (</w:t>
+            </w:r>
+            <w:r>
+              <w:rPr>
+                <w:color w:val="166534"/>
+                <w:sz w:val="18"/>
+                <w:szCs w:val="18"/>
+              </w:rPr>
+              <w:t>30/60/90), Supplier name and code, and Contract start and end date. Outputs structured JSON or CSV ready for Bronze layer loading. (3) Human Validation Queue: Low confidence extractions flagged for Sipho's team to review and confirm before loading to Bronze. Prevents incorrect contracted rates from entering the price variance calculation.</w:t>
             </w:r>
           </w:p>
         </w:tc>
@@ -3625,20 +4082,8 @@
                 <w:sz w:val="18"/>
                 <w:szCs w:val="18"/>
               </w:rPr>
-              <w:t xml:space="preserve">Consequences if </w:t>
-            </w:r>
-            <w:proofErr w:type="gramStart"/>
-            <w:r>
-              <w:rPr>
-                <w:b/>
-                <w:bCs/>
-                <w:color w:val="1A2E5A"/>
-                <w:sz w:val="18"/>
-                <w:szCs w:val="18"/>
-              </w:rPr>
-              <w:t>Delayed</w:t>
-            </w:r>
-            <w:proofErr w:type="gramEnd"/>
+              <w:t>Consequences if Delayed</w:t>
+            </w:r>
           </w:p>
         </w:tc>
         <w:tc>
@@ -3665,25 +4110,7 @@
                 <w:sz w:val="18"/>
                 <w:szCs w:val="18"/>
               </w:rPr>
-              <w:t xml:space="preserve">Until resolved: price variance against contracted rates metric cannot be calculated. This is one of Sipho's five required KPIs. Affects Procurement domain </w:t>
-            </w:r>
-            <w:proofErr w:type="gramStart"/>
-            <w:r>
-              <w:rPr>
-                <w:color w:val="8B1A1A"/>
-                <w:sz w:val="18"/>
-                <w:szCs w:val="18"/>
-              </w:rPr>
-              <w:t>Gold</w:t>
-            </w:r>
-            <w:proofErr w:type="gramEnd"/>
-            <w:r>
-              <w:rPr>
-                <w:color w:val="8B1A1A"/>
-                <w:sz w:val="18"/>
-                <w:szCs w:val="18"/>
-              </w:rPr>
-              <w:t xml:space="preserve"> layer completeness.</w:t>
+              <w:t>Until resolved, the price variance against contracted rates metric cannot be calculated. This is one of Sipho's five required KPIs. Affects the Procurement domain Gold layer completeness</w:t>
             </w:r>
           </w:p>
         </w:tc>
@@ -3715,6 +4142,7 @@
                 <w:sz w:val="18"/>
                 <w:szCs w:val="18"/>
               </w:rPr>
+              <w:lastRenderedPageBreak/>
               <w:t>Dependencies</w:t>
             </w:r>
           </w:p>
@@ -3744,7 +4172,7 @@
                 <w:sz w:val="18"/>
                 <w:szCs w:val="18"/>
               </w:rPr>
-              <w:t>Sample of 10-15 supplier contracts required for extraction testing. Procurement team availability for validation queue management.</w:t>
+              <w:t>A sample of 10-15 supplier contracts is required for extraction testing. Procurement team availability for validation queue management.</w:t>
             </w:r>
           </w:p>
         </w:tc>
@@ -3856,7 +4284,17 @@
                 <w:sz w:val="18"/>
                 <w:szCs w:val="18"/>
               </w:rPr>
-              <w:t>DECIDED — 01 June 2026</w:t>
+              <w:t>APPROVED</w:t>
+            </w:r>
+            <w:r>
+              <w:rPr>
+                <w:b/>
+                <w:bCs/>
+                <w:color w:val="166534"/>
+                <w:sz w:val="18"/>
+                <w:szCs w:val="18"/>
+              </w:rPr>
+              <w:t xml:space="preserve"> — 01 June 2026</w:t>
             </w:r>
           </w:p>
         </w:tc>
@@ -4088,7 +4526,6 @@
                 <w:sz w:val="18"/>
                 <w:szCs w:val="18"/>
               </w:rPr>
-              <w:lastRenderedPageBreak/>
               <w:t>Due</w:t>
             </w:r>
           </w:p>
@@ -4175,25 +4612,7 @@
                 <w:sz w:val="18"/>
                 <w:szCs w:val="18"/>
               </w:rPr>
-              <w:t xml:space="preserve">We have about 10 multi-source systems (different types of data structures) from which we are extracting data. Audit trail requirement, allowing us to reprocess from the </w:t>
-            </w:r>
-            <w:proofErr w:type="gramStart"/>
-            <w:r>
-              <w:rPr>
-                <w:color w:val="1A1A1A"/>
-                <w:sz w:val="18"/>
-                <w:szCs w:val="18"/>
-              </w:rPr>
-              <w:t>Bronze</w:t>
-            </w:r>
-            <w:proofErr w:type="gramEnd"/>
-            <w:r>
-              <w:rPr>
-                <w:color w:val="1A1A1A"/>
-                <w:sz w:val="18"/>
-                <w:szCs w:val="18"/>
-              </w:rPr>
-              <w:t xml:space="preserve"> layer, as there will be no need to re-extract from the sources, and only the changed data is being processed, which will save us time in case of failure and the need to reprocess the pipeline. Each layer processes only what has changed since the last run. Bronze captures raw changes. Silver transforms only new records. The Gold layer refreshes only affected aggregates.</w:t>
+              <w:t>We have about 10 multi-source systems (different types of data structures) from which we are extracting data. Audit trail requirement, allowing us to reprocess from the Bronze layer, as there will be no need to re-extract from the sources, and only the changed data is being processed, which will save us time in case of failure and the need to reprocess the pipeline. Each layer processes only what has changed since the last run. Bronze captures raw changes. Silver transforms only new records. The Gold layer refreshes only affected aggregates.</w:t>
             </w:r>
           </w:p>
         </w:tc>
@@ -4294,20 +4713,8 @@
                 <w:sz w:val="18"/>
                 <w:szCs w:val="18"/>
               </w:rPr>
-              <w:t xml:space="preserve">Consequences if </w:t>
-            </w:r>
-            <w:proofErr w:type="gramStart"/>
-            <w:r>
-              <w:rPr>
-                <w:b/>
-                <w:bCs/>
-                <w:color w:val="1A2E5A"/>
-                <w:sz w:val="18"/>
-                <w:szCs w:val="18"/>
-              </w:rPr>
-              <w:t>Delayed</w:t>
-            </w:r>
-            <w:proofErr w:type="gramEnd"/>
+              <w:t>Consequences if Delayed</w:t>
+            </w:r>
           </w:p>
         </w:tc>
         <w:tc>
@@ -4511,7 +4918,17 @@
                 <w:sz w:val="18"/>
                 <w:szCs w:val="18"/>
               </w:rPr>
-              <w:t>Decided - 01 June 2026</w:t>
+              <w:t>APPROVED</w:t>
+            </w:r>
+            <w:r>
+              <w:rPr>
+                <w:b/>
+                <w:bCs/>
+                <w:color w:val="166534"/>
+                <w:sz w:val="18"/>
+                <w:szCs w:val="18"/>
+              </w:rPr>
+              <w:t xml:space="preserve"> - 01 June 2026</w:t>
             </w:r>
           </w:p>
         </w:tc>
@@ -4903,20 +5320,8 @@
                 <w:sz w:val="18"/>
                 <w:szCs w:val="18"/>
               </w:rPr>
-              <w:t xml:space="preserve">Consequences if </w:t>
-            </w:r>
-            <w:proofErr w:type="gramStart"/>
-            <w:r>
-              <w:rPr>
-                <w:b/>
-                <w:bCs/>
-                <w:color w:val="1A2E5A"/>
-                <w:sz w:val="18"/>
-                <w:szCs w:val="18"/>
-              </w:rPr>
-              <w:t>Delayed</w:t>
-            </w:r>
-            <w:proofErr w:type="gramEnd"/>
+              <w:t>Consequences if Delayed</w:t>
+            </w:r>
           </w:p>
         </w:tc>
         <w:tc>
@@ -5206,6 +5611,7 @@
                 <w:sz w:val="18"/>
                 <w:szCs w:val="18"/>
               </w:rPr>
+              <w:lastRenderedPageBreak/>
               <w:t>Triggered By</w:t>
             </w:r>
           </w:p>
@@ -5470,16 +5876,7 @@
                 <w:sz w:val="18"/>
                 <w:szCs w:val="18"/>
               </w:rPr>
-              <w:t xml:space="preserve">PENDING — Key decisions required: (1) Attribution model type: last-click, first-click, linear, time-decay, or data-driven. (2) Attribution window: how many days between campaign touchpoint and transaction counts as a conversion. (3) Cross-channel weighting: how to handle a customer who </w:t>
-            </w:r>
-            <w:r>
-              <w:rPr>
-                <w:color w:val="8B1A1A"/>
-                <w:sz w:val="18"/>
-                <w:szCs w:val="18"/>
-              </w:rPr>
-              <w:lastRenderedPageBreak/>
-              <w:t>touches multiple channels before converting. (4) Treatment of anonymous-to-known conversion events.</w:t>
+              <w:t>PENDING — Key decisions required: (1) Attribution model type: last-click, first-click, linear, time-decay, or data-driven. (2) Attribution window: how many days between campaign touchpoint and transaction counts as a conversion. (3) Cross-channel weighting: how to handle a customer who touches multiple channels before converting. (4) Treatment of anonymous-to-known conversion events.</w:t>
             </w:r>
           </w:p>
         </w:tc>
@@ -5511,21 +5908,8 @@
                 <w:sz w:val="18"/>
                 <w:szCs w:val="18"/>
               </w:rPr>
-              <w:lastRenderedPageBreak/>
-              <w:t xml:space="preserve">Consequences if </w:t>
-            </w:r>
-            <w:proofErr w:type="gramStart"/>
-            <w:r>
-              <w:rPr>
-                <w:b/>
-                <w:bCs/>
-                <w:color w:val="1A2E5A"/>
-                <w:sz w:val="18"/>
-                <w:szCs w:val="18"/>
-              </w:rPr>
-              <w:t>Delayed</w:t>
-            </w:r>
-            <w:proofErr w:type="gramEnd"/>
+              <w:t>Consequences if Delayed</w:t>
+            </w:r>
           </w:p>
         </w:tc>
         <w:tc>
@@ -5639,27 +6023,7 @@
           <w:sz w:val="26"/>
           <w:szCs w:val="26"/>
         </w:rPr>
-        <w:t>ADR-00</w:t>
-      </w:r>
-      <w:r>
-        <w:rPr>
-          <w:b/>
-          <w:bCs/>
-          <w:color w:val="1A2E5A"/>
-          <w:sz w:val="26"/>
-          <w:szCs w:val="26"/>
-        </w:rPr>
-        <w:t>7</w:t>
-      </w:r>
-      <w:r>
-        <w:rPr>
-          <w:b/>
-          <w:bCs/>
-          <w:color w:val="1A2E5A"/>
-          <w:sz w:val="26"/>
-          <w:szCs w:val="26"/>
-        </w:rPr>
-        <w:t xml:space="preserve"> — </w:t>
+        <w:t xml:space="preserve">ADR-007 — </w:t>
       </w:r>
       <w:r>
         <w:rPr>
@@ -6050,23 +6414,7 @@
                 <w:sz w:val="18"/>
                 <w:szCs w:val="18"/>
               </w:rPr>
-              <w:t xml:space="preserve">This must be formally agreed and signed before any governance logic is built. Covers tiered ingestion design, </w:t>
-            </w:r>
-            <w:r>
-              <w:rPr>
-                <w:color w:val="1A1A1A"/>
-                <w:sz w:val="18"/>
-                <w:szCs w:val="18"/>
-              </w:rPr>
-              <w:t>suppression</w:t>
-            </w:r>
-            <w:r>
-              <w:rPr>
-                <w:color w:val="1A1A1A"/>
-                <w:sz w:val="18"/>
-                <w:szCs w:val="18"/>
-              </w:rPr>
-              <w:t xml:space="preserve"> logic, breach alerting, and cross-system propagation rules. At-risk member flag - three components required: Last purchase date - from Sales fact table, Last category purchased - derived from Sales fact table joined to Product dimension. Last engagement date - from Contact History fact table.</w:t>
+              <w:t>This must be formally agreed and signed before any governance logic is built. Covers tiered ingestion design, suppression logic, breach alerting, and cross-system propagation rules. At-risk member flag - three components required: Last purchase date - from Sales fact table, Last category purchased - derived from Sales fact table joined to Product dimension. Last engagement date - from Contact History fact table.</w:t>
             </w:r>
           </w:p>
         </w:tc>
@@ -6163,20 +6511,8 @@
                 <w:sz w:val="18"/>
                 <w:szCs w:val="18"/>
               </w:rPr>
-              <w:t xml:space="preserve">Consequences if </w:t>
-            </w:r>
-            <w:proofErr w:type="gramStart"/>
-            <w:r>
-              <w:rPr>
-                <w:b/>
-                <w:bCs/>
-                <w:color w:val="1A2E5A"/>
-                <w:sz w:val="18"/>
-                <w:szCs w:val="18"/>
-              </w:rPr>
-              <w:t>Delayed</w:t>
-            </w:r>
-            <w:proofErr w:type="gramEnd"/>
+              <w:t>Consequences if Delayed</w:t>
+            </w:r>
           </w:p>
         </w:tc>
         <w:tc>
@@ -6307,7 +6643,7 @@
           <w:sz w:val="16"/>
           <w:szCs w:val="16"/>
         </w:rPr>
-        <w:t>ADR-REG-001 v1.</w:t>
+        <w:t>ADR-REG-001 v</w:t>
       </w:r>
       <w:r>
         <w:rPr>
@@ -6317,7 +6653,7 @@
           <w:sz w:val="16"/>
           <w:szCs w:val="16"/>
         </w:rPr>
-        <w:t>2</w:t>
+        <w:t>2.0</w:t>
       </w:r>
       <w:r>
         <w:rPr>
@@ -6605,7 +6941,23 @@
               <w:sz w:val="16"/>
               <w:szCs w:val="16"/>
             </w:rPr>
-            <w:t>CONFIDENTIAL | v1.0</w:t>
+            <w:t>CONFIDENTIAL | v</w:t>
+          </w:r>
+          <w:r>
+            <w:rPr>
+              <w:color w:val="555555"/>
+              <w:sz w:val="16"/>
+              <w:szCs w:val="16"/>
+            </w:rPr>
+            <w:t>2</w:t>
+          </w:r>
+          <w:r>
+            <w:rPr>
+              <w:color w:val="555555"/>
+              <w:sz w:val="16"/>
+              <w:szCs w:val="16"/>
+            </w:rPr>
+            <w:t>.0</w:t>
           </w:r>
         </w:p>
       </w:tc>

</xml_diff>